<commit_message>
Ajusta promessa do Diagnóstico (não afirmar que resolve tudo) e fechamentos dos vídeos 2, 3 e 8
Co-Authored-By: Claude Sonnet 5 <noreply@anthropic.com>
Claude-Session: https://claude.ai/code/session_01GQSqEjEuqv44iBdACeUWUZ
</commit_message>
<xml_diff>
--- a/eleva/roteiros-videos-cursos-sessao-diagnostico-mentoria.docx
+++ b/eleva/roteiros-videos-cursos-sessao-diagnostico-mentoria.docx
@@ -964,7 +964,7 @@
           <w:sz w:val="21"/>
           <w:szCs w:val="21"/>
         </w:rPr>
-        <w:t xml:space="preserve">"Foi por isso que eu criei o Diagnóstico Empresarial da Eleva: um mapeamento do seu negócio para você enxergar, com clareza, todos os pontos que estão travando o seu crescimento, e entender quais são as possíveis alavancas para contornar isso tudo."</w:t>
+        <w:t xml:space="preserve">"Foi por isso que eu criei o Diagnóstico Empresarial da Eleva: um mapeamento do seu negócio para você enxergar, com clareza, os pontos que estão travando o seu crescimento, e entender quais são as possíveis alavancas para contornar esses gargalos."</w:t>
       </w:r>
     </w:p>
     <w:p>
@@ -988,7 +988,7 @@
           <w:sz w:val="21"/>
           <w:szCs w:val="21"/>
         </w:rPr>
-        <w:t xml:space="preserve">"Se você quer saber mais informações de tudo que eu entrego nesse diagnóstico, comente aqui: DIAGNÓSTICO, que eu vou enviar todos os detalhes no seu direct. Ou, se preferir, clique no nosso link da bio."</w:t>
+        <w:t xml:space="preserve">"Se você quer saber mais informações sobre esse Diagnóstico Empresarial, comente: DIAGNÓSTICO, que eu vou enviar todos os detalhes no seu direct. Ou, se preferir, clique no nosso link da bio para mais informações."</w:t>
       </w:r>
     </w:p>
     <w:p>
@@ -1081,7 +1081,7 @@
           <w:sz w:val="21"/>
           <w:szCs w:val="21"/>
         </w:rPr>
-        <w:t xml:space="preserve">O Diagnóstico Empresarial da Eleva mapeia o seu negócio com clareza, mostrando todos os pontos que estão travando o crescimento e as alavancas para contornar isso.</w:t>
+        <w:t xml:space="preserve">O Diagnóstico Empresarial da Eleva mapeia o seu negócio com clareza, mostrando os pontos que estão travando o crescimento e as alavancas para contornar esses gargalos.</w:t>
       </w:r>
     </w:p>
     <w:p>
@@ -1222,7 +1222,7 @@
           <w:sz w:val="21"/>
           <w:szCs w:val="21"/>
         </w:rPr>
-        <w:t xml:space="preserve">"Se você quer saber em detalhes como funciona a mentoria, comente: MENTORIA, que eu vou enviar todos os detalhes no seu direct. Ou, se preferir, acesse pelo link da bio."</w:t>
+        <w:t xml:space="preserve">"Se você quer saber mais detalhes de como funciona a mentoria, comente: MENTORIA, e então eu vou te enviar todos esses detalhes no seu direct. Ou, se preferir, acesse pelo link da bio."</w:t>
       </w:r>
     </w:p>
     <w:p>
@@ -2317,7 +2317,7 @@
           <w:sz w:val="21"/>
           <w:szCs w:val="21"/>
         </w:rPr>
-        <w:t xml:space="preserve">"Se você gostaria de saber mais informações, ou se interessa em aplicar para ser um parceiro do nosso Hub de Negócios, comente: Hub de Negócios, que vamos enviar todas as informações no seu direct, para que você possa aplicar e saber em detalhes como participar."</w:t>
+        <w:t xml:space="preserve">"Se você gostaria de saber mais informações, ou tem interesse em aplicar para ser um parceiro do nosso Hub de Negócios, comente: Hub de Negócios, que vamos enviar todas as informações no seu direct."</w:t>
       </w:r>
     </w:p>
     <w:p>

</xml_diff>

<commit_message>
Adiciona abertura chamando a persona pelo nome nos vídeos de público específico (síndico, fornecedor, futuro síndico)
Co-Authored-By: Claude Sonnet 5 <noreply@anthropic.com>
Claude-Session: https://claude.ai/code/session_01GQSqEjEuqv44iBdACeUWUZ
</commit_message>
<xml_diff>
--- a/eleva/roteiros-videos-cursos-sessao-diagnostico-mentoria.docx
+++ b/eleva/roteiros-videos-cursos-sessao-diagnostico-mentoria.docx
@@ -1616,7 +1616,7 @@
           <w:sz w:val="21"/>
           <w:szCs w:val="21"/>
         </w:rPr>
-        <w:t xml:space="preserve">"Sabe qual é a diferença entre o síndico que gerencia 3 condomínios com dificuldade e o que gerencia 20 com tranquilidade?"</w:t>
+        <w:t xml:space="preserve">"Síndico. Sabe qual é a diferença entre o síndico que gerencia 3 condomínios com dificuldade e o que gerencia 20 com tranquilidade?"</w:t>
       </w:r>
     </w:p>
     <w:p>
@@ -1837,7 +1837,7 @@
           <w:sz w:val="21"/>
           <w:szCs w:val="21"/>
         </w:rPr>
-        <w:t xml:space="preserve">"Deixa eu te contar uma coisa que muda completamente como você enxerga esse mercado."</w:t>
+        <w:t xml:space="preserve">"Fornecedor. Deixa eu te contar uma coisa que muda completamente como você enxerga esse mercado."</w:t>
       </w:r>
     </w:p>
     <w:p>
@@ -2053,7 +2053,7 @@
           <w:sz w:val="21"/>
           <w:szCs w:val="21"/>
         </w:rPr>
-        <w:t xml:space="preserve">"Você já pensou em se tornar síndico profissional? É uma das profissões que mais cresce no Brasil, remunerada, com demanda real e crescente, mas que exige método para você entrar com segurança."</w:t>
+        <w:t xml:space="preserve">"Futuro síndico. Você já pensou em se tornar síndico profissional? É uma das profissões que mais cresce no Brasil, remunerada, com demanda real e crescente, mas que exige método para você entrar com segurança."</w:t>
       </w:r>
     </w:p>
     <w:p>

</xml_diff>